<commit_message>
docs: atualizar documentacao SDD e manuais (workflow de branches, categorias, skill /feature)
- 05-DEPLOY-GUIDE.md: fluxo de deploy atualizado para refletir merge de branch CR antes do push
- Plano-de-evolucao.md: P1-3 concluido (Revisao de Seguranca como Fase do Fluxo SDD)
- categorias_gastos.md: sincronizado com CR-018 (IPVA, IPTU, Impostos, Emprestimo)
- templates/00-template-change-request.md: metodo de rollback via branch hotfix
- templates/CLAUDE-template.md: adiciona secao de fluxo de branches e merge workflow
- generate_manual.py / generate_manual_es.py: referencias a skill /feature e fluxo CR em 8 passos
- manual-workflow-sdd.docx / manual-workflow-sdd-es.docx: manuais regenerados (v1.0 04/03/2026)
- generate_manual_pratico.py + manual-pratico-sdd.docx: novo manual pratico SDD
- backend/scripts/propagate_categories_mar2026.py: script pontual de propagacao de categorias

Co-Authored-By: Claude Sonnet 4.6 <noreply@anthropic.com>
</commit_message>
<xml_diff>
--- a/docs/manual-workflow-sdd-es.docx
+++ b/docs/manual-workflow-sdd-es.docx
@@ -113,7 +113,7 @@
           <w:color w:val="717D7E"/>
           <w:sz w:val="20"/>
         </w:rPr>
-        <w:t>Version 1.0  *  20/02/2026</w:t>
+        <w:t>Version 1.0  *  04/03/2026</w:t>
       </w:r>
     </w:p>
     <w:p>
@@ -5344,6 +5344,47 @@
         <w:t>Usa el siguiente prompt al iniciar una nueva conversacion con un agente de IA (como Claude) para configurar el flujo SDD en un nuevo proyecto. Adapta los campos entre corchetes.</w:t>
       </w:r>
     </w:p>
+    <w:tbl>
+      <w:tblPr>
+        <w:tblW w:type="auto" w:w="0"/>
+        <w:tblLook w:firstColumn="1" w:firstRow="1" w:lastColumn="0" w:lastRow="0" w:noHBand="0" w:noVBand="1" w:val="04A0"/>
+        <w:tblCellMar>
+          <w:top w:w="80" w:type="dxa"/>
+          <w:bottom w:w="80" w:type="dxa"/>
+          <w:left w:w="80" w:type="dxa"/>
+          <w:right w:w="80" w:type="dxa"/>
+        </w:tblCellMar>
+      </w:tblPr>
+      <w:tblGrid>
+        <w:gridCol w:w="9122"/>
+      </w:tblGrid>
+      <w:tr>
+        <w:tc>
+          <w:tcPr>
+            <w:tcW w:type="dxa" w:w="9360"/>
+            <w:shd w:val="clear" w:color="auto" w:fill="E8DAEF"/>
+          </w:tcPr>
+          <w:p>
+            <w:pPr>
+              <w:spacing w:before="120" w:after="120"/>
+            </w:pPr>
+            <w:r>
+              <w:rPr>
+                <w:b w:val="0"/>
+                <w:sz w:val="20"/>
+              </w:rPr>
+              <w:t>Atajo recomendado - Skill /feature (Claude Code)</w:t>
+              <w:br/>
+              <w:br/>
+              <w:t>Si usas Claude Code con la skill /feature configurada, no tenes que copiar los prompts de abajo manualmente. Basta con invocar /feature en una nueva conversacion: la skill lee el CLAUDE.md, determina automaticamente el modo (Nuevo Proyecto o Change Request), crea los documentos, abre la branch, implementa, hace revision de seguridad, valida el build y realiza el commit/merge, todo sin intervencion manual.</w:t>
+              <w:br/>
+              <w:br/>
+              <w:t>Los prompts a continuacion son utiles para entender el proceso en detalle o para ambientes donde la skill no esta configurada.</w:t>
+            </w:r>
+          </w:p>
+        </w:tc>
+      </w:tr>
+    </w:tbl>
     <w:p>
       <w:pPr>
         <w:spacing w:before="0" w:after="0"/>
@@ -5577,6 +5618,46 @@
         <w:spacing w:before="0" w:after="0"/>
       </w:pPr>
     </w:p>
+    <w:tbl>
+      <w:tblPr>
+        <w:tblW w:type="auto" w:w="0"/>
+        <w:tblLook w:firstColumn="1" w:firstRow="1" w:lastColumn="0" w:lastRow="0" w:noHBand="0" w:noVBand="1" w:val="04A0"/>
+        <w:tblCellMar>
+          <w:top w:w="80" w:type="dxa"/>
+          <w:bottom w:w="80" w:type="dxa"/>
+          <w:left w:w="80" w:type="dxa"/>
+          <w:right w:w="80" w:type="dxa"/>
+        </w:tblCellMar>
+      </w:tblPr>
+      <w:tblGrid>
+        <w:gridCol w:w="9122"/>
+      </w:tblGrid>
+      <w:tr>
+        <w:tc>
+          <w:tcPr>
+            <w:tcW w:type="dxa" w:w="9360"/>
+            <w:shd w:val="clear" w:color="auto" w:fill="E8DAEF"/>
+          </w:tcPr>
+          <w:p>
+            <w:pPr>
+              <w:spacing w:before="120" w:after="120"/>
+            </w:pPr>
+            <w:r>
+              <w:rPr>
+                <w:b w:val="0"/>
+                <w:sz w:val="20"/>
+              </w:rPr>
+              <w:t>Alternativa con skill: En Claude Code, usa /feature en lugar de este prompt. La skill ejecuta el flujo de CR completo de forma automatizada: creacion del documento CR, branch, implementacion, revision de seguridad, build y commit.</w:t>
+            </w:r>
+          </w:p>
+        </w:tc>
+      </w:tr>
+    </w:tbl>
+    <w:p>
+      <w:pPr>
+        <w:spacing w:before="0" w:after="0"/>
+      </w:pPr>
+    </w:p>
     <w:p>
       <w:r>
         <w:br w:type="page"/>
@@ -6421,6 +6502,52 @@
           </w:p>
         </w:tc>
       </w:tr>
+      <w:tr>
+        <w:tc>
+          <w:tcPr>
+            <w:tcW w:type="dxa" w:w="3041"/>
+            <w:shd w:val="clear" w:color="auto" w:fill="F2F3F4"/>
+          </w:tcPr>
+          <w:p>
+            <w:r>
+              <w:rPr>
+                <w:sz w:val="20"/>
+              </w:rPr>
+              <w:t>Quiero automatizar el pipeline SDD</w:t>
+            </w:r>
+          </w:p>
+        </w:tc>
+        <w:tc>
+          <w:tcPr>
+            <w:tcW w:type="dxa" w:w="3041"/>
+            <w:shd w:val="clear" w:color="auto" w:fill="6C3483"/>
+          </w:tcPr>
+          <w:p>
+            <w:r>
+              <w:rPr>
+                <w:b/>
+                <w:color w:val="FFFFFF"/>
+                <w:sz w:val="20"/>
+              </w:rPr>
+              <w:t>Skill /feature (Claude Code)</w:t>
+            </w:r>
+          </w:p>
+        </w:tc>
+        <w:tc>
+          <w:tcPr>
+            <w:tcW w:type="dxa" w:w="3041"/>
+            <w:shd w:val="clear" w:color="auto" w:fill="F2F3F4"/>
+          </w:tcPr>
+          <w:p>
+            <w:r>
+              <w:rPr>
+                <w:sz w:val="20"/>
+              </w:rPr>
+              <w:t>.claude/skills/feature/</w:t>
+            </w:r>
+          </w:p>
+        </w:tc>
+      </w:tr>
     </w:tbl>
     <w:p>
       <w:pPr>
@@ -6787,7 +6914,7 @@
               <w:rPr>
                 <w:sz w:val="22"/>
               </w:rPr>
-              <w:t>Crear el CR en docs/changes/CR-[XXX]-[slug].md usando el template</w:t>
+              <w:t>Crear el CR + branch: git checkout -b feat/CR-[XXX]-[slug]</w:t>
             </w:r>
           </w:p>
         </w:tc>
@@ -7032,7 +7159,7 @@
               <w:rPr>
                 <w:sz w:val="22"/>
               </w:rPr>
-              <w:t>Commit y push referenciando el CR: feat: CR-XXX - descripcion</w:t>
+              <w:t>Merge y push: git merge feat/CR-XXX --no-ff + git push origin master</w:t>
             </w:r>
           </w:p>
         </w:tc>

</xml_diff>